<commit_message>
Updated Lending Club portfolio page
</commit_message>
<xml_diff>
--- a/_site/resume.docx
+++ b/_site/resume.docx
@@ -96,7 +96,10 @@
               <w:contextualSpacing w:val="0"/>
             </w:pPr>
             <w:r>
-              <w:t xml:space="preserve">envoss11.github.io </w:t>
+              <w:t>ericvoss.com</w:t>
+            </w:r>
+            <w:r>
+              <w:t xml:space="preserve"> </w:t>
             </w:r>
             <w:sdt>
               <w:sdtPr>
@@ -110,6 +113,7 @@
                 <w:showingPlcHdr/>
                 <w15:appearance w15:val="hidden"/>
               </w:sdtPr>
+              <w:sdtEndPr/>
               <w:sdtContent>
                 <w:r>
                   <w:t>·</w:t>
@@ -27152,10 +27156,12 @@
     <w:rsid w:val="00025116"/>
     <w:rsid w:val="001E02CF"/>
     <w:rsid w:val="001E5FFB"/>
+    <w:rsid w:val="00771DF8"/>
     <w:rsid w:val="007E72D2"/>
     <w:rsid w:val="00821DBA"/>
     <w:rsid w:val="00854075"/>
     <w:rsid w:val="008A4DCF"/>
+    <w:rsid w:val="008D73A7"/>
     <w:rsid w:val="00AB629E"/>
     <w:rsid w:val="00B43A28"/>
     <w:rsid w:val="00B51A40"/>
@@ -27640,10 +27646,6 @@
     <w:name w:val="82912E53C046C84B93F677C3178BFBA4"/>
     <w:rsid w:val="001E5FFB"/>
   </w:style>
-  <w:style w:type="paragraph" w:customStyle="1" w:styleId="6C109008628C2D4A942E95591E6979B4">
-    <w:name w:val="6C109008628C2D4A942E95591E6979B4"/>
-    <w:rsid w:val="001E5FFB"/>
-  </w:style>
   <w:style w:type="paragraph" w:customStyle="1" w:styleId="A1CA74A5AA83AE42806AAD4237D85F39">
     <w:name w:val="A1CA74A5AA83AE42806AAD4237D85F39"/>
     <w:rsid w:val="00AB629E"/>

</xml_diff>